<commit_message>
add reference links to all completed documents
</commit_message>
<xml_diff>
--- a/public/docs/FuelSync_Business_Strategy.docx
+++ b/public/docs/FuelSync_Business_Strategy.docx
@@ -3703,6 +3703,220 @@
           <w:szCs w:val="24"/>
         </w:rPr>
         <w:t xml:space="preserve">FuelSync enters a fast-growing Australian market — valued at AUD $63–200M in 2024 with strong double-digit growth — through a positioning that no incumbent can easily replicate: behaviour-first, shame-free, community-powered, and architecturally designed around the emotional mechanics of lasting food habits. The NDIS pathway provides a funded, defensible revenue stream unique to this product. The founder's personal proof of concept, combined with an agent-native architecture and a proprietary behavioural data moat, creates a compounding competitive advantage that strengthens with every user who finds their anchor meal.</w:t>
+      </w:r>
+    </w:p>
+    <w:p>
+      <w:pPr>
+        <w:spacing w:after="480" w:before="0"/>
+      </w:pPr>
+    </w:p>
+    <w:p>
+      <w:pPr>
+        <w:spacing w:after="120" w:before="400"/>
+      </w:pPr>
+      <w:r>
+        <w:rPr>
+          <w:rFonts w:ascii="Arial" w:cs="Arial" w:eastAsia="Arial" w:hAnsi="Arial"/>
+          <w:b/>
+          <w:bCs/>
+          <w:color w:val="1A1A2E"/>
+          <w:sz w:val="26"/>
+          <w:szCs w:val="26"/>
+        </w:rPr>
+        <w:t xml:space="preserve">References</w:t>
+      </w:r>
+    </w:p>
+    <w:p>
+      <w:pPr>
+        <w:spacing w:after="200" w:before="0"/>
+      </w:pPr>
+      <w:r>
+        <w:rPr>
+          <w:rFonts w:ascii="Arial" w:cs="Arial" w:eastAsia="Arial" w:hAnsi="Arial"/>
+          <w:color w:val="4A4A6A"/>
+          <w:sz w:val="24"/>
+          <w:szCs w:val="24"/>
+        </w:rPr>
+        <w:t xml:space="preserve">Grand View Research. (2024). Australia Diet and Nutrition Apps Market Outlook.</w:t>
+      </w:r>
+    </w:p>
+    <w:p>
+      <w:pPr>
+        <w:spacing w:after="200" w:before="0"/>
+      </w:pPr>
+      <w:r>
+        <w:rPr>
+          <w:rFonts w:ascii="Arial" w:cs="Arial" w:eastAsia="Arial" w:hAnsi="Arial"/>
+          <w:color w:val="4A4A6A"/>
+          <w:sz w:val="24"/>
+          <w:szCs w:val="24"/>
+        </w:rPr>
+        <w:t xml:space="preserve">https://www.grandviewresearch.com/horizon/outlook/diet-and-nutrition-apps-market/australia</w:t>
+      </w:r>
+    </w:p>
+    <w:p>
+      <w:pPr>
+        <w:spacing w:after="80" w:before="0"/>
+      </w:pPr>
+    </w:p>
+    <w:p>
+      <w:pPr>
+        <w:spacing w:after="200" w:before="0"/>
+      </w:pPr>
+      <w:r>
+        <w:rPr>
+          <w:rFonts w:ascii="Arial" w:cs="Arial" w:eastAsia="Arial" w:hAnsi="Arial"/>
+          <w:color w:val="4A4A6A"/>
+          <w:sz w:val="24"/>
+          <w:szCs w:val="24"/>
+        </w:rPr>
+        <w:t xml:space="preserve">Data Bridge Market Research. (2024). Australia Diet and Nutrition Apps Market to 2032.</w:t>
+      </w:r>
+    </w:p>
+    <w:p>
+      <w:pPr>
+        <w:spacing w:after="200" w:before="0"/>
+      </w:pPr>
+      <w:r>
+        <w:rPr>
+          <w:rFonts w:ascii="Arial" w:cs="Arial" w:eastAsia="Arial" w:hAnsi="Arial"/>
+          <w:color w:val="4A4A6A"/>
+          <w:sz w:val="24"/>
+          <w:szCs w:val="24"/>
+        </w:rPr>
+        <w:t xml:space="preserve">https://www.databridgemarketresearch.com/nucleus/australia-diet-and-nutrition-apps-market</w:t>
+      </w:r>
+    </w:p>
+    <w:p>
+      <w:pPr>
+        <w:spacing w:after="80" w:before="0"/>
+      </w:pPr>
+    </w:p>
+    <w:p>
+      <w:pPr>
+        <w:spacing w:after="200" w:before="0"/>
+      </w:pPr>
+      <w:r>
+        <w:rPr>
+          <w:rFonts w:ascii="Arial" w:cs="Arial" w:eastAsia="Arial" w:hAnsi="Arial"/>
+          <w:color w:val="4A4A6A"/>
+          <w:sz w:val="24"/>
+          <w:szCs w:val="24"/>
+        </w:rPr>
+        <w:t xml:space="preserve">Sensor Tower. (2024). Q1–Q2 2024 Top Food and Diet Tracking Apps — Australia.</w:t>
+      </w:r>
+    </w:p>
+    <w:p>
+      <w:pPr>
+        <w:spacing w:after="200" w:before="0"/>
+      </w:pPr>
+      <w:r>
+        <w:rPr>
+          <w:rFonts w:ascii="Arial" w:cs="Arial" w:eastAsia="Arial" w:hAnsi="Arial"/>
+          <w:color w:val="4A4A6A"/>
+          <w:sz w:val="24"/>
+          <w:szCs w:val="24"/>
+        </w:rPr>
+        <w:t xml:space="preserve">https://sensortower.com/blog/2024-q1-unified-top-5-food-and-diet-tracking-units-au</w:t>
+      </w:r>
+    </w:p>
+    <w:p>
+      <w:pPr>
+        <w:spacing w:after="80" w:before="0"/>
+      </w:pPr>
+    </w:p>
+    <w:p>
+      <w:pPr>
+        <w:spacing w:after="200" w:before="0"/>
+      </w:pPr>
+      <w:r>
+        <w:rPr>
+          <w:rFonts w:ascii="Arial" w:cs="Arial" w:eastAsia="Arial" w:hAnsi="Arial"/>
+          <w:color w:val="4A4A6A"/>
+          <w:sz w:val="24"/>
+          <w:szCs w:val="24"/>
+        </w:rPr>
+        <w:t xml:space="preserve">Riaz, H., et al. (2022). User Engagement and Abandonment of mHealth: A Cross-Sectional Survey. International Journal of Environmental Research and Public Health.</w:t>
+      </w:r>
+    </w:p>
+    <w:p>
+      <w:pPr>
+        <w:spacing w:after="200" w:before="0"/>
+      </w:pPr>
+      <w:r>
+        <w:rPr>
+          <w:rFonts w:ascii="Arial" w:cs="Arial" w:eastAsia="Arial" w:hAnsi="Arial"/>
+          <w:color w:val="4A4A6A"/>
+          <w:sz w:val="24"/>
+          <w:szCs w:val="24"/>
+        </w:rPr>
+        <w:t xml:space="preserve">https://pmc.ncbi.nlm.nih.gov/articles/PMC8872344/</w:t>
+      </w:r>
+    </w:p>
+    <w:p>
+      <w:pPr>
+        <w:spacing w:after="80" w:before="0"/>
+      </w:pPr>
+    </w:p>
+    <w:p>
+      <w:pPr>
+        <w:spacing w:after="200" w:before="0"/>
+      </w:pPr>
+      <w:r>
+        <w:rPr>
+          <w:rFonts w:ascii="Arial" w:cs="Arial" w:eastAsia="Arial" w:hAnsi="Arial"/>
+          <w:color w:val="4A4A6A"/>
+          <w:sz w:val="24"/>
+          <w:szCs w:val="24"/>
+        </w:rPr>
+        <w:t xml:space="preserve">Kidman, R., et al. (2024). When and Why Adults Abandon Lifestyle Behavior and Mental Health Mobile Apps: Scoping Review. Journal of Medical Internet Research.</w:t>
+      </w:r>
+    </w:p>
+    <w:p>
+      <w:pPr>
+        <w:spacing w:after="200" w:before="0"/>
+      </w:pPr>
+      <w:r>
+        <w:rPr>
+          <w:rFonts w:ascii="Arial" w:cs="Arial" w:eastAsia="Arial" w:hAnsi="Arial"/>
+          <w:color w:val="4A4A6A"/>
+          <w:sz w:val="24"/>
+          <w:szCs w:val="24"/>
+        </w:rPr>
+        <w:t xml:space="preserve">https://www.jmir.org/2024/1/e56897/</w:t>
+      </w:r>
+    </w:p>
+    <w:p>
+      <w:pPr>
+        <w:spacing w:after="80" w:before="0"/>
+      </w:pPr>
+    </w:p>
+    <w:p>
+      <w:pPr>
+        <w:spacing w:after="200" w:before="0"/>
+      </w:pPr>
+      <w:r>
+        <w:rPr>
+          <w:rFonts w:ascii="Arial" w:cs="Arial" w:eastAsia="Arial" w:hAnsi="Arial"/>
+          <w:color w:val="4A4A6A"/>
+          <w:sz w:val="24"/>
+          <w:szCs w:val="24"/>
+        </w:rPr>
+        <w:t xml:space="preserve">National Disability Insurance Agency. (2024). NDIS Participant Numbers and Plan Data.</w:t>
+      </w:r>
+    </w:p>
+    <w:p>
+      <w:pPr>
+        <w:spacing w:after="200" w:before="0"/>
+      </w:pPr>
+      <w:r>
+        <w:rPr>
+          <w:rFonts w:ascii="Arial" w:cs="Arial" w:eastAsia="Arial" w:hAnsi="Arial"/>
+          <w:color w:val="4A4A6A"/>
+          <w:sz w:val="24"/>
+          <w:szCs w:val="24"/>
+        </w:rPr>
+        <w:t xml:space="preserve">https://www.ndis.gov.au/about-us/data-publications-and-resources</w:t>
       </w:r>
     </w:p>
     <w:p>

</xml_diff>

<commit_message>
all 10 documents complete — final versions with gap fills
</commit_message>
<xml_diff>
--- a/public/docs/FuelSync_Business_Strategy.docx
+++ b/public/docs/FuelSync_Business_Strategy.docx
@@ -2412,7 +2412,7 @@
           <w:sz w:val="24"/>
           <w:szCs w:val="24"/>
         </w:rPr>
-        <w:t xml:space="preserve">Brisbane launch precision. Launching in a single market with real grocery price integration (Coles, Woolworths, local markets) creates a hyper-relevant experience that national or global apps cannot replicate. Community trust builds faster when the app knows your postcode.</w:t>
+        <w:t xml:space="preserve">Brisbane launch precision. Launching in a single market with community-sourced local pricing creates a hyper-relevant experience that national or global apps cannot replicate. When users create meal cards they input what they paid and where they bought it — Coles, Woolworths, local Asian grocers, Pacific Island markets, corner stores. The community becomes the price database. No API required, no supermarket dependency, and culturally accurate pricing that a centralised feed could never deliver. When the ACCC's mandatory pricing API legislation passes, that data feeds directly into the already-built system — adding a second pricing layer on top of the community foundation.</w:t>
       </w:r>
     </w:p>
     <w:p>
@@ -2675,7 +2675,7 @@
           <w:sz w:val="24"/>
           <w:szCs w:val="24"/>
         </w:rPr>
-        <w:t xml:space="preserve">Integrate Coles/Woolworths price data for Brisbane suburb meal cards</w:t>
+        <w:t xml:space="preserve">Launch community meal card pricing — users input what they paid and where they bought ingredients when creating meal cards. This builds a hyperlocal, culturally accurate price database from day one without any API dependency.</w:t>
       </w:r>
     </w:p>
     <w:p>
@@ -2846,7 +2846,7 @@
           <w:sz w:val="24"/>
           <w:szCs w:val="24"/>
         </w:rPr>
-        <w:t xml:space="preserve">National Australian rollout with expanded grocery price integration</w:t>
+        <w:t xml:space="preserve">Integrate official supermarket pricing API once ACCC mandatory pricing legislation passes — feeds directly into the already-built community pricing system, adding a second verified data layer alongside community-sourced prices</w:t>
       </w:r>
     </w:p>
     <w:p>

</xml_diff>